<commit_message>
Refresh generated DOCX guides
</commit_message>
<xml_diff>
--- a/odigoi/02_pycharm_local_authoring.docx
+++ b/odigoi/02_pycharm_local_authoring.docx
@@ -20,7 +20,7 @@
           <w:sz w:val="22"/>
           <w:szCs w:val="22"/>
         </w:rPr>
-        <w:id w:val="1057050244"/>
+        <w:id w:val="2058584595"/>
         <w:docPartObj>
           <w:docPartGallery w:val="Table of Contents"/>
           <w:docPartUnique/>
@@ -61,7 +61,7 @@
           <w:r>
             <w:fldChar w:fldCharType="separate"/>
           </w:r>
-          <w:hyperlink w:anchor="_Toc225618516" w:history="1">
+          <w:hyperlink w:anchor="_Toc225688214" w:history="1">
             <w:r>
               <w:rPr>
                 <w:rStyle w:val="Hyperlink"/>
@@ -88,7 +88,7 @@
                 <w:noProof/>
                 <w:webHidden/>
               </w:rPr>
-              <w:instrText xml:space="preserve"> PAGEREF _Toc225618516 \h </w:instrText>
+              <w:instrText xml:space="preserve"> PAGEREF _Toc225688214 \h </w:instrText>
             </w:r>
             <w:r>
               <w:rPr>
@@ -135,7 +135,7 @@
               <w14:ligatures w14:val="standardContextual"/>
             </w:rPr>
           </w:pPr>
-          <w:hyperlink w:anchor="_Toc225618517" w:history="1">
+          <w:hyperlink w:anchor="_Toc225688215" w:history="1">
             <w:r>
               <w:rPr>
                 <w:rStyle w:val="Hyperlink"/>
@@ -162,7 +162,7 @@
                 <w:noProof/>
                 <w:webHidden/>
               </w:rPr>
-              <w:instrText xml:space="preserve"> PAGEREF _Toc225618517 \h </w:instrText>
+              <w:instrText xml:space="preserve"> PAGEREF _Toc225688215 \h </w:instrText>
             </w:r>
             <w:r>
               <w:rPr>
@@ -209,7 +209,7 @@
               <w14:ligatures w14:val="standardContextual"/>
             </w:rPr>
           </w:pPr>
-          <w:hyperlink w:anchor="_Toc225618518" w:history="1">
+          <w:hyperlink w:anchor="_Toc225688216" w:history="1">
             <w:r>
               <w:rPr>
                 <w:rStyle w:val="Hyperlink"/>
@@ -236,7 +236,7 @@
                 <w:noProof/>
                 <w:webHidden/>
               </w:rPr>
-              <w:instrText xml:space="preserve"> PAGEREF _Toc225618518 \h </w:instrText>
+              <w:instrText xml:space="preserve"> PAGEREF _Toc225688216 \h </w:instrText>
             </w:r>
             <w:r>
               <w:rPr>
@@ -283,7 +283,7 @@
               <w14:ligatures w14:val="standardContextual"/>
             </w:rPr>
           </w:pPr>
-          <w:hyperlink w:anchor="_Toc225618519" w:history="1">
+          <w:hyperlink w:anchor="_Toc225688217" w:history="1">
             <w:r>
               <w:rPr>
                 <w:rStyle w:val="Hyperlink"/>
@@ -310,7 +310,7 @@
                 <w:noProof/>
                 <w:webHidden/>
               </w:rPr>
-              <w:instrText xml:space="preserve"> PAGEREF _Toc225618519 \h </w:instrText>
+              <w:instrText xml:space="preserve"> PAGEREF _Toc225688217 \h </w:instrText>
             </w:r>
             <w:r>
               <w:rPr>
@@ -357,7 +357,7 @@
               <w14:ligatures w14:val="standardContextual"/>
             </w:rPr>
           </w:pPr>
-          <w:hyperlink w:anchor="_Toc225618520" w:history="1">
+          <w:hyperlink w:anchor="_Toc225688218" w:history="1">
             <w:r>
               <w:rPr>
                 <w:rStyle w:val="Hyperlink"/>
@@ -384,7 +384,7 @@
                 <w:noProof/>
                 <w:webHidden/>
               </w:rPr>
-              <w:instrText xml:space="preserve"> PAGEREF _Toc225618520 \h </w:instrText>
+              <w:instrText xml:space="preserve"> PAGEREF _Toc225688218 \h </w:instrText>
             </w:r>
             <w:r>
               <w:rPr>
@@ -431,7 +431,7 @@
               <w14:ligatures w14:val="standardContextual"/>
             </w:rPr>
           </w:pPr>
-          <w:hyperlink w:anchor="_Toc225618521" w:history="1">
+          <w:hyperlink w:anchor="_Toc225688219" w:history="1">
             <w:r>
               <w:rPr>
                 <w:rStyle w:val="Hyperlink"/>
@@ -458,7 +458,7 @@
                 <w:noProof/>
                 <w:webHidden/>
               </w:rPr>
-              <w:instrText xml:space="preserve"> PAGEREF _Toc225618521 \h </w:instrText>
+              <w:instrText xml:space="preserve"> PAGEREF _Toc225688219 \h </w:instrText>
             </w:r>
             <w:r>
               <w:rPr>
@@ -505,7 +505,7 @@
               <w14:ligatures w14:val="standardContextual"/>
             </w:rPr>
           </w:pPr>
-          <w:hyperlink w:anchor="_Toc225618522" w:history="1">
+          <w:hyperlink w:anchor="_Toc225688220" w:history="1">
             <w:r>
               <w:rPr>
                 <w:rStyle w:val="Hyperlink"/>
@@ -541,7 +541,7 @@
                 <w:noProof/>
                 <w:webHidden/>
               </w:rPr>
-              <w:instrText xml:space="preserve"> PAGEREF _Toc225618522 \h </w:instrText>
+              <w:instrText xml:space="preserve"> PAGEREF _Toc225688220 \h </w:instrText>
             </w:r>
             <w:r>
               <w:rPr>
@@ -588,7 +588,7 @@
               <w14:ligatures w14:val="standardContextual"/>
             </w:rPr>
           </w:pPr>
-          <w:hyperlink w:anchor="_Toc225618523" w:history="1">
+          <w:hyperlink w:anchor="_Toc225688221" w:history="1">
             <w:r>
               <w:rPr>
                 <w:rStyle w:val="Hyperlink"/>
@@ -624,7 +624,7 @@
                 <w:noProof/>
                 <w:webHidden/>
               </w:rPr>
-              <w:instrText xml:space="preserve"> PAGEREF _Toc225618523 \h </w:instrText>
+              <w:instrText xml:space="preserve"> PAGEREF _Toc225688221 \h </w:instrText>
             </w:r>
             <w:r>
               <w:rPr>
@@ -671,7 +671,7 @@
               <w14:ligatures w14:val="standardContextual"/>
             </w:rPr>
           </w:pPr>
-          <w:hyperlink w:anchor="_Toc225618524" w:history="1">
+          <w:hyperlink w:anchor="_Toc225688222" w:history="1">
             <w:r>
               <w:rPr>
                 <w:rStyle w:val="Hyperlink"/>
@@ -698,7 +698,7 @@
                 <w:noProof/>
                 <w:webHidden/>
               </w:rPr>
-              <w:instrText xml:space="preserve"> PAGEREF _Toc225618524 \h </w:instrText>
+              <w:instrText xml:space="preserve"> PAGEREF _Toc225688222 \h </w:instrText>
             </w:r>
             <w:r>
               <w:rPr>
@@ -745,7 +745,7 @@
               <w14:ligatures w14:val="standardContextual"/>
             </w:rPr>
           </w:pPr>
-          <w:hyperlink w:anchor="_Toc225618525" w:history="1">
+          <w:hyperlink w:anchor="_Toc225688223" w:history="1">
             <w:r>
               <w:rPr>
                 <w:rStyle w:val="Hyperlink"/>
@@ -772,7 +772,7 @@
                 <w:noProof/>
                 <w:webHidden/>
               </w:rPr>
-              <w:instrText xml:space="preserve"> PAGEREF _Toc225618525 \h </w:instrText>
+              <w:instrText xml:space="preserve"> PAGEREF _Toc225688223 \h </w:instrText>
             </w:r>
             <w:r>
               <w:rPr>
@@ -819,7 +819,7 @@
               <w14:ligatures w14:val="standardContextual"/>
             </w:rPr>
           </w:pPr>
-          <w:hyperlink w:anchor="_Toc225618526" w:history="1">
+          <w:hyperlink w:anchor="_Toc225688224" w:history="1">
             <w:r>
               <w:rPr>
                 <w:rStyle w:val="Hyperlink"/>
@@ -846,7 +846,7 @@
                 <w:noProof/>
                 <w:webHidden/>
               </w:rPr>
-              <w:instrText xml:space="preserve"> PAGEREF _Toc225618526 \h </w:instrText>
+              <w:instrText xml:space="preserve"> PAGEREF _Toc225688224 \h </w:instrText>
             </w:r>
             <w:r>
               <w:rPr>
@@ -893,7 +893,7 @@
               <w14:ligatures w14:val="standardContextual"/>
             </w:rPr>
           </w:pPr>
-          <w:hyperlink w:anchor="_Toc225618527" w:history="1">
+          <w:hyperlink w:anchor="_Toc225688225" w:history="1">
             <w:r>
               <w:rPr>
                 <w:rStyle w:val="Hyperlink"/>
@@ -920,7 +920,7 @@
                 <w:noProof/>
                 <w:webHidden/>
               </w:rPr>
-              <w:instrText xml:space="preserve"> PAGEREF _Toc225618527 \h </w:instrText>
+              <w:instrText xml:space="preserve"> PAGEREF _Toc225688225 \h </w:instrText>
             </w:r>
             <w:r>
               <w:rPr>
@@ -963,7 +963,7 @@
         <w:pStyle w:val="Heading1"/>
       </w:pPr>
       <w:bookmarkStart w:id="0" w:name="ρύθμιση-του-τοπικού-περιβάλλοντος"/>
-      <w:bookmarkStart w:id="1" w:name="_Toc225618516"/>
+      <w:bookmarkStart w:id="1" w:name="_Toc225688214"/>
       <w:r>
         <w:t>Ρύθμιση του τοπικού περιβάλλοντος</w:t>
       </w:r>
@@ -1086,7 +1086,7 @@
         <w:pStyle w:val="Heading1"/>
       </w:pPr>
       <w:bookmarkStart w:id="2" w:name="άνοιγμα-του-repository-στο-pycharm"/>
-      <w:bookmarkStart w:id="3" w:name="_Toc225618517"/>
+      <w:bookmarkStart w:id="3" w:name="_Toc225688215"/>
       <w:bookmarkEnd w:id="0"/>
       <w:r>
         <w:t>Άνοιγμα του repository στο PyCharm</w:t>
@@ -1215,7 +1215,7 @@
           <w:noProof/>
         </w:rPr>
         <w:drawing>
-          <wp:inline distT="0" distB="0" distL="0" distR="0">
+          <wp:inline distT="0" distB="0" distL="0" distR="0" wp14:anchorId="2F5DECB5" wp14:editId="414EB345">
             <wp:extent cx="6692900" cy="2845691"/>
             <wp:effectExtent l="0" t="0" r="0" b="0"/>
             <wp:docPr id="26" name="Picture" descr="Εικόνα 1"/>
@@ -1374,7 +1374,7 @@
         </w:rPr>
         <w:lastRenderedPageBreak/>
         <w:drawing>
-          <wp:inline distT="0" distB="0" distL="0" distR="0">
+          <wp:inline distT="0" distB="0" distL="0" distR="0" wp14:anchorId="03403DE7" wp14:editId="5293869B">
             <wp:extent cx="6692900" cy="5494042"/>
             <wp:effectExtent l="0" t="0" r="0" b="0"/>
             <wp:docPr id="29" name="Picture" descr="Εικόνα 2"/>
@@ -1443,7 +1443,7 @@
         </w:rPr>
         <w:lastRenderedPageBreak/>
         <w:drawing>
-          <wp:inline distT="0" distB="0" distL="0" distR="0">
+          <wp:inline distT="0" distB="0" distL="0" distR="0" wp14:anchorId="009FD14A" wp14:editId="0E2CBA5C">
             <wp:extent cx="6692900" cy="4748374"/>
             <wp:effectExtent l="0" t="0" r="0" b="0"/>
             <wp:docPr id="32" name="Picture" descr="Εικόνα 3"/>
@@ -1490,7 +1490,7 @@
         <w:pStyle w:val="Heading1"/>
       </w:pPr>
       <w:bookmarkStart w:id="4" w:name="εγκατάσταση-python-πακέτων"/>
-      <w:bookmarkStart w:id="5" w:name="_Toc225618518"/>
+      <w:bookmarkStart w:id="5" w:name="_Toc225688216"/>
       <w:bookmarkEnd w:id="2"/>
       <w:r>
         <w:t>Εγκατάσταση Python πακέτων</w:t>
@@ -1637,7 +1637,7 @@
         <w:pStyle w:val="Heading1"/>
       </w:pPr>
       <w:bookmarkStart w:id="6" w:name="έλεγχος-java"/>
-      <w:bookmarkStart w:id="7" w:name="_Toc225618519"/>
+      <w:bookmarkStart w:id="7" w:name="_Toc225688217"/>
       <w:bookmarkEnd w:id="4"/>
       <w:r>
         <w:t>Έλεγχος Java</w:t>
@@ -1714,7 +1714,7 @@
         <w:pStyle w:val="Heading1"/>
       </w:pPr>
       <w:bookmarkStart w:id="8" w:name="δημιουργία-αρχείων-παραδείγματος"/>
-      <w:bookmarkStart w:id="9" w:name="_Toc225618520"/>
+      <w:bookmarkStart w:id="9" w:name="_Toc225688218"/>
       <w:bookmarkEnd w:id="6"/>
       <w:r>
         <w:lastRenderedPageBreak/>
@@ -2446,7 +2446,7 @@
         <w:pStyle w:val="Heading1"/>
       </w:pPr>
       <w:bookmarkStart w:id="10" w:name="εκτέλεση-και-debugging-στο-pycharm"/>
-      <w:bookmarkStart w:id="11" w:name="_Toc225618521"/>
+      <w:bookmarkStart w:id="11" w:name="_Toc225688219"/>
       <w:bookmarkEnd w:id="8"/>
       <w:r>
         <w:t>Εκτέλεση και debugging στο PyCharm</w:t>
@@ -2619,7 +2619,7 @@
         <w:pStyle w:val="Heading1"/>
       </w:pPr>
       <w:bookmarkStart w:id="12" w:name="πειραματισμός-με-pyspark"/>
-      <w:bookmarkStart w:id="13" w:name="_Toc225618522"/>
+      <w:bookmarkStart w:id="13" w:name="_Toc225688220"/>
       <w:bookmarkEnd w:id="10"/>
       <w:r>
         <w:t xml:space="preserve">Πειραματισμός με </w:t>
@@ -2756,7 +2756,7 @@
         <w:pStyle w:val="Heading2"/>
       </w:pPr>
       <w:bookmarkStart w:id="14" w:name="επιλογή-1-pyspark"/>
-      <w:bookmarkStart w:id="15" w:name="_Toc225618523"/>
+      <w:bookmarkStart w:id="15" w:name="_Toc225688221"/>
       <w:r>
         <w:t xml:space="preserve">Επιλογή 1: </w:t>
       </w:r>
@@ -3147,7 +3147,7 @@
         <w:pStyle w:val="Heading2"/>
       </w:pPr>
       <w:bookmarkStart w:id="16" w:name="Xf8a74baa69a0d34389477600a5e339ef5be52f4"/>
-      <w:bookmarkStart w:id="17" w:name="_Toc225618524"/>
+      <w:bookmarkStart w:id="17" w:name="_Toc225688222"/>
       <w:bookmarkEnd w:id="14"/>
       <w:r>
         <w:lastRenderedPageBreak/>
@@ -3476,7 +3476,7 @@
         <w:pStyle w:val="Heading1"/>
       </w:pPr>
       <w:bookmarkStart w:id="18" w:name="έλεγχος-του-spark-ui"/>
-      <w:bookmarkStart w:id="19" w:name="_Toc225618525"/>
+      <w:bookmarkStart w:id="19" w:name="_Toc225688223"/>
       <w:bookmarkEnd w:id="12"/>
       <w:bookmarkEnd w:id="16"/>
       <w:r>
@@ -3512,7 +3512,7 @@
         <w:pStyle w:val="Heading1"/>
       </w:pPr>
       <w:bookmarkStart w:id="20" w:name="επόμενος-τοπικός-οδηγός"/>
-      <w:bookmarkStart w:id="21" w:name="_Toc225618526"/>
+      <w:bookmarkStart w:id="21" w:name="_Toc225688224"/>
       <w:bookmarkEnd w:id="18"/>
       <w:r>
         <w:t>Επόμενος τοπικός οδηγός</w:t>
@@ -3552,7 +3552,7 @@
         </w:rPr>
         <w:lastRenderedPageBreak/>
         <w:drawing>
-          <wp:inline distT="0" distB="0" distL="0" distR="0">
+          <wp:inline distT="0" distB="0" distL="0" distR="0" wp14:anchorId="64F610EB" wp14:editId="4EF4073C">
             <wp:extent cx="6692900" cy="3213434"/>
             <wp:effectExtent l="0" t="0" r="0" b="0"/>
             <wp:docPr id="46" name="Picture" descr="Εικόνα 4"/>
@@ -3599,7 +3599,7 @@
         <w:pStyle w:val="Heading1"/>
       </w:pPr>
       <w:bookmarkStart w:id="22" w:name="χρήσιμες-παρατηρήσεις"/>
-      <w:bookmarkStart w:id="23" w:name="_Toc225618527"/>
+      <w:bookmarkStart w:id="23" w:name="_Toc225688225"/>
       <w:bookmarkEnd w:id="20"/>
       <w:r>
         <w:t>Χρήσιμες παρατηρήσεις</w:t>
@@ -4218,7 +4218,7 @@
   <w:abstractNum w:abstractNumId="9" w15:restartNumberingAfterBreak="0">
     <w:nsid w:val="0000A990"/>
     <w:multiLevelType w:val="multilevel"/>
-    <w:tmpl w:val="2B826B0C"/>
+    <w:tmpl w:val="5C80F850"/>
     <w:lvl w:ilvl="0">
       <w:numFmt w:val="bullet"/>
       <w:lvlText w:val=" "/>
@@ -4295,7 +4295,7 @@
   <w:abstractNum w:abstractNumId="10" w15:restartNumberingAfterBreak="0">
     <w:nsid w:val="0000A991"/>
     <w:multiLevelType w:val="multilevel"/>
-    <w:tmpl w:val="8AC08CE4"/>
+    <w:tmpl w:val="0DC0DB2C"/>
     <w:lvl w:ilvl="0">
       <w:numFmt w:val="bullet"/>
       <w:lvlText w:val=""/>
@@ -4396,64 +4396,64 @@
       </w:rPr>
     </w:lvl>
   </w:abstractNum>
-  <w:num w:numId="1" w16cid:durableId="857935027">
+  <w:num w:numId="1" w16cid:durableId="167837733">
     <w:abstractNumId w:val="8"/>
   </w:num>
-  <w:num w:numId="2" w16cid:durableId="973411047">
+  <w:num w:numId="2" w16cid:durableId="1197741833">
     <w:abstractNumId w:val="6"/>
   </w:num>
-  <w:num w:numId="3" w16cid:durableId="578101764">
+  <w:num w:numId="3" w16cid:durableId="455803420">
     <w:abstractNumId w:val="5"/>
   </w:num>
-  <w:num w:numId="4" w16cid:durableId="742605484">
+  <w:num w:numId="4" w16cid:durableId="1220747112">
     <w:abstractNumId w:val="4"/>
   </w:num>
-  <w:num w:numId="5" w16cid:durableId="231236739">
+  <w:num w:numId="5" w16cid:durableId="239482961">
     <w:abstractNumId w:val="7"/>
   </w:num>
-  <w:num w:numId="6" w16cid:durableId="1165127724">
+  <w:num w:numId="6" w16cid:durableId="25765511">
     <w:abstractNumId w:val="3"/>
   </w:num>
-  <w:num w:numId="7" w16cid:durableId="1126898734">
+  <w:num w:numId="7" w16cid:durableId="1095596458">
     <w:abstractNumId w:val="2"/>
   </w:num>
-  <w:num w:numId="8" w16cid:durableId="853110592">
+  <w:num w:numId="8" w16cid:durableId="1042368191">
     <w:abstractNumId w:val="1"/>
   </w:num>
-  <w:num w:numId="9" w16cid:durableId="708410589">
+  <w:num w:numId="9" w16cid:durableId="2020885759">
     <w:abstractNumId w:val="0"/>
   </w:num>
-  <w:num w:numId="10" w16cid:durableId="698359865">
+  <w:num w:numId="10" w16cid:durableId="567883144">
     <w:abstractNumId w:val="9"/>
   </w:num>
-  <w:num w:numId="11" w16cid:durableId="343286527">
+  <w:num w:numId="11" w16cid:durableId="1261137141">
     <w:abstractNumId w:val="10"/>
   </w:num>
-  <w:num w:numId="12" w16cid:durableId="813762766">
+  <w:num w:numId="12" w16cid:durableId="594048481">
     <w:abstractNumId w:val="10"/>
   </w:num>
-  <w:num w:numId="13" w16cid:durableId="1889027675">
+  <w:num w:numId="13" w16cid:durableId="931087714">
     <w:abstractNumId w:val="10"/>
   </w:num>
-  <w:num w:numId="14" w16cid:durableId="1754081651">
+  <w:num w:numId="14" w16cid:durableId="852374961">
     <w:abstractNumId w:val="10"/>
   </w:num>
-  <w:num w:numId="15" w16cid:durableId="533613657">
+  <w:num w:numId="15" w16cid:durableId="1680354134">
     <w:abstractNumId w:val="10"/>
   </w:num>
-  <w:num w:numId="16" w16cid:durableId="7414216">
+  <w:num w:numId="16" w16cid:durableId="1081220252">
     <w:abstractNumId w:val="10"/>
   </w:num>
-  <w:num w:numId="17" w16cid:durableId="1688410859">
+  <w:num w:numId="17" w16cid:durableId="2071804286">
     <w:abstractNumId w:val="10"/>
   </w:num>
-  <w:num w:numId="18" w16cid:durableId="238290336">
+  <w:num w:numId="18" w16cid:durableId="396126035">
     <w:abstractNumId w:val="10"/>
   </w:num>
-  <w:num w:numId="19" w16cid:durableId="662855142">
+  <w:num w:numId="19" w16cid:durableId="1911693440">
     <w:abstractNumId w:val="10"/>
   </w:num>
-  <w:num w:numId="20" w16cid:durableId="1856000035">
+  <w:num w:numId="20" w16cid:durableId="1682850149">
     <w:abstractNumId w:val="10"/>
   </w:num>
 </w:numbering>
@@ -16274,7 +16274,7 @@
     <w:autoRedefine/>
     <w:uiPriority w:val="39"/>
     <w:unhideWhenUsed/>
-    <w:rsid w:val="00DB007B"/>
+    <w:rsid w:val="00AB3E19"/>
     <w:pPr>
       <w:spacing w:after="100"/>
     </w:pPr>
@@ -16286,7 +16286,7 @@
     <w:autoRedefine/>
     <w:uiPriority w:val="39"/>
     <w:unhideWhenUsed/>
-    <w:rsid w:val="00DB007B"/>
+    <w:rsid w:val="00AB3E19"/>
     <w:pPr>
       <w:spacing w:after="100"/>
       <w:ind w:left="220"/>
@@ -16297,7 +16297,7 @@
     <w:basedOn w:val="DefaultParagraphFont"/>
     <w:uiPriority w:val="99"/>
     <w:unhideWhenUsed/>
-    <w:rsid w:val="00DB007B"/>
+    <w:rsid w:val="00AB3E19"/>
     <w:rPr>
       <w:color w:val="0000FF" w:themeColor="hyperlink"/>
       <w:u w:val="single"/>

</xml_diff>